<commit_message>
Fix formatting in markdown header and correct spelling in template document
</commit_message>
<xml_diff>
--- a/template.docx
+++ b/template.docx
@@ -27,16 +27,13 @@
         <w:ind w:left="-5" w:hanging="10"/>
       </w:pPr>
       <w:r>
-        <w:rPr>
-          <w:u w:val="single" w:color="000000"/>
-        </w:rPr>
         <w:t>Telemóvel</w:t>
       </w:r>
       <w:r>
         <w:t xml:space="preserve">: </w:t>
       </w:r>
       <w:r>
-        <w:t>{{CONTACTO}}</w:t>
+        <w:t>{{CONTATO}}</w:t>
       </w:r>
       <w:r>
         <w:t xml:space="preserve">  </w:t>
@@ -48,9 +45,6 @@
         <w:ind w:left="-5" w:hanging="10"/>
       </w:pPr>
       <w:r>
-        <w:rPr>
-          <w:u w:val="single" w:color="000000"/>
-        </w:rPr>
         <w:t>Email</w:t>
       </w:r>
       <w:r>
@@ -76,8 +70,6 @@
       </w:pPr>
       <w:r>
         <w:rPr>
-          <w:b/>
-          <w:bCs/>
           <w:sz w:val="24"/>
         </w:rPr>
         <w:t>Cliente:</w:t>
@@ -120,16 +112,12 @@
       </w:pPr>
       <w:r>
         <w:rPr>
-          <w:b/>
-          <w:bCs/>
           <w:sz w:val="24"/>
         </w:rPr>
         <w:t>Local</w:t>
       </w:r>
       <w:r>
         <w:rPr>
-          <w:b/>
-          <w:bCs/>
           <w:sz w:val="24"/>
         </w:rPr>
         <w:t>:</w:t>
@@ -214,21 +202,12 @@
               <w:ind w:right="111"/>
               <w:jc w:val="center"/>
             </w:pPr>
-            <w:proofErr w:type="spellStart"/>
             <w:r>
               <w:rPr>
                 <w:b/>
                 <w:sz w:val="24"/>
               </w:rPr>
-              <w:t>Art</w:t>
-            </w:r>
-            <w:proofErr w:type="spellEnd"/>
-            <w:r>
-              <w:rPr>
-                <w:b/>
-                <w:sz w:val="24"/>
-              </w:rPr>
-              <w:t xml:space="preserve">. </w:t>
+              <w:t xml:space="preserve">Art. </w:t>
             </w:r>
             <w:r>
               <w:t xml:space="preserve"> </w:t>
@@ -280,21 +259,12 @@
             <w:pPr>
               <w:ind w:left="2"/>
             </w:pPr>
-            <w:proofErr w:type="spellStart"/>
             <w:r>
               <w:rPr>
                 <w:b/>
                 <w:sz w:val="24"/>
               </w:rPr>
-              <w:t>Unid</w:t>
-            </w:r>
-            <w:proofErr w:type="spellEnd"/>
-            <w:r>
-              <w:rPr>
-                <w:b/>
-                <w:sz w:val="24"/>
-              </w:rPr>
-              <w:t xml:space="preserve">. </w:t>
+              <w:t xml:space="preserve">Unid. </w:t>
             </w:r>
             <w:r>
               <w:t xml:space="preserve"> </w:t>
@@ -318,21 +288,12 @@
               <w:ind w:right="103"/>
               <w:jc w:val="center"/>
             </w:pPr>
-            <w:proofErr w:type="spellStart"/>
             <w:r>
               <w:rPr>
                 <w:b/>
                 <w:sz w:val="24"/>
               </w:rPr>
-              <w:t>Qt</w:t>
-            </w:r>
-            <w:proofErr w:type="spellEnd"/>
-            <w:r>
-              <w:rPr>
-                <w:b/>
-                <w:sz w:val="24"/>
-              </w:rPr>
-              <w:t xml:space="preserve">. </w:t>
+              <w:t xml:space="preserve">Qt. </w:t>
             </w:r>
             <w:r>
               <w:t xml:space="preserve"> </w:t>
@@ -360,23 +321,7 @@
                 <w:b/>
                 <w:sz w:val="24"/>
               </w:rPr>
-              <w:t xml:space="preserve">Preço </w:t>
-            </w:r>
-            <w:proofErr w:type="spellStart"/>
-            <w:r>
-              <w:rPr>
-                <w:b/>
-                <w:sz w:val="24"/>
-              </w:rPr>
-              <w:t>Un</w:t>
-            </w:r>
-            <w:proofErr w:type="spellEnd"/>
-            <w:r>
-              <w:rPr>
-                <w:b/>
-                <w:sz w:val="24"/>
-              </w:rPr>
-              <w:t xml:space="preserve">. </w:t>
+              <w:t xml:space="preserve">Preço Un. </w:t>
             </w:r>
             <w:r>
               <w:t xml:space="preserve"> </w:t>

</xml_diff>